<commit_message>
update file bao cao và cac file
</commit_message>
<xml_diff>
--- a/BaoCao/B2111908_LuanVan _TinhChinhAndKhongTinhChinh.docx
+++ b/BaoCao/B2111908_LuanVan _TinhChinhAndKhongTinhChinh.docx
@@ -25600,7 +25600,7 @@
                 <w:sz w:val="26"/>
                 <w:szCs w:val="26"/>
               </w:rPr>
-              <w:t>0.8636</w:t>
+              <w:t>0.8348</w:t>
             </w:r>
           </w:p>
         </w:tc>
@@ -27132,14 +27132,13 @@
     <w:tbl>
       <w:tblPr>
         <w:tblStyle w:val="PlainTable1"/>
-        <w:tblW w:w="5729" w:type="dxa"/>
+        <w:tblW w:w="3828" w:type="dxa"/>
         <w:jc w:val="center"/>
         <w:tblLook w:val="04A0" w:firstRow="1" w:lastRow="0" w:firstColumn="1" w:lastColumn="0" w:noHBand="0" w:noVBand="1"/>
       </w:tblPr>
       <w:tblGrid>
         <w:gridCol w:w="1985"/>
         <w:gridCol w:w="1843"/>
-        <w:gridCol w:w="1901"/>
       </w:tblGrid>
       <w:tr>
         <w:trPr>
@@ -27156,13 +27155,21 @@
             <w:pPr>
               <w:spacing w:before="120" w:after="120"/>
               <w:ind w:left="-113"/>
-              <w:jc w:val="both"/>
-              <w:rPr>
-                <w:color w:val="000000"/>
-                <w:sz w:val="26"/>
-                <w:szCs w:val="26"/>
-              </w:rPr>
-            </w:pPr>
+              <w:jc w:val="center"/>
+              <w:rPr>
+                <w:color w:val="000000"/>
+                <w:sz w:val="26"/>
+                <w:szCs w:val="26"/>
+              </w:rPr>
+            </w:pPr>
+            <w:r>
+              <w:rPr>
+                <w:color w:val="000000"/>
+                <w:sz w:val="26"/>
+                <w:szCs w:val="26"/>
+              </w:rPr>
+              <w:t>Mô hình</w:t>
+            </w:r>
           </w:p>
         </w:tc>
         <w:tc>
@@ -27188,23 +27195,6 @@
               </w:rPr>
               <w:t>Tham số</w:t>
             </w:r>
-          </w:p>
-        </w:tc>
-        <w:tc>
-          <w:tcPr>
-            <w:tcW w:w="1901" w:type="dxa"/>
-          </w:tcPr>
-          <w:p>
-            <w:pPr>
-              <w:spacing w:before="120" w:after="120"/>
-              <w:jc w:val="center"/>
-              <w:cnfStyle w:val="100000000000" w:firstRow="1" w:lastRow="0" w:firstColumn="0" w:lastColumn="0" w:oddVBand="0" w:evenVBand="0" w:oddHBand="0" w:evenHBand="0" w:firstRowFirstColumn="0" w:firstRowLastColumn="0" w:lastRowFirstColumn="0" w:lastRowLastColumn="0"/>
-              <w:rPr>
-                <w:color w:val="000000"/>
-                <w:sz w:val="26"/>
-                <w:szCs w:val="26"/>
-              </w:rPr>
-            </w:pPr>
           </w:p>
         </w:tc>
       </w:tr>
@@ -27264,23 +27254,6 @@
             </w:r>
           </w:p>
         </w:tc>
-        <w:tc>
-          <w:tcPr>
-            <w:tcW w:w="1901" w:type="dxa"/>
-          </w:tcPr>
-          <w:p>
-            <w:pPr>
-              <w:spacing w:before="120" w:after="120"/>
-              <w:jc w:val="center"/>
-              <w:cnfStyle w:val="000000100000" w:firstRow="0" w:lastRow="0" w:firstColumn="0" w:lastColumn="0" w:oddVBand="0" w:evenVBand="0" w:oddHBand="1" w:evenHBand="0" w:firstRowFirstColumn="0" w:firstRowLastColumn="0" w:lastRowFirstColumn="0" w:lastRowLastColumn="0"/>
-              <w:rPr>
-                <w:color w:val="000000"/>
-                <w:sz w:val="26"/>
-                <w:szCs w:val="26"/>
-              </w:rPr>
-            </w:pPr>
-          </w:p>
-        </w:tc>
       </w:tr>
       <w:tr>
         <w:trPr>
@@ -27335,23 +27308,6 @@
               </w:rPr>
               <w:t>12M70</w:t>
             </w:r>
-          </w:p>
-        </w:tc>
-        <w:tc>
-          <w:tcPr>
-            <w:tcW w:w="1901" w:type="dxa"/>
-          </w:tcPr>
-          <w:p>
-            <w:pPr>
-              <w:spacing w:before="120" w:after="120"/>
-              <w:jc w:val="both"/>
-              <w:cnfStyle w:val="000000000000" w:firstRow="0" w:lastRow="0" w:firstColumn="0" w:lastColumn="0" w:oddVBand="0" w:evenVBand="0" w:oddHBand="0" w:evenHBand="0" w:firstRowFirstColumn="0" w:firstRowLastColumn="0" w:lastRowFirstColumn="0" w:lastRowLastColumn="0"/>
-              <w:rPr>
-                <w:color w:val="000000"/>
-                <w:sz w:val="26"/>
-                <w:szCs w:val="26"/>
-              </w:rPr>
-            </w:pPr>
           </w:p>
         </w:tc>
       </w:tr>
@@ -27411,23 +27367,6 @@
             </w:r>
           </w:p>
         </w:tc>
-        <w:tc>
-          <w:tcPr>
-            <w:tcW w:w="1901" w:type="dxa"/>
-          </w:tcPr>
-          <w:p>
-            <w:pPr>
-              <w:spacing w:before="120" w:after="120"/>
-              <w:jc w:val="both"/>
-              <w:cnfStyle w:val="000000100000" w:firstRow="0" w:lastRow="0" w:firstColumn="0" w:lastColumn="0" w:oddVBand="0" w:evenVBand="0" w:oddHBand="1" w:evenHBand="0" w:firstRowFirstColumn="0" w:firstRowLastColumn="0" w:lastRowFirstColumn="0" w:lastRowLastColumn="0"/>
-              <w:rPr>
-                <w:color w:val="000000"/>
-                <w:sz w:val="26"/>
-                <w:szCs w:val="26"/>
-              </w:rPr>
-            </w:pPr>
-          </w:p>
-        </w:tc>
       </w:tr>
       <w:tr>
         <w:trPr>
@@ -27482,23 +27421,6 @@
               </w:rPr>
               <w:t>6M11</w:t>
             </w:r>
-          </w:p>
-        </w:tc>
-        <w:tc>
-          <w:tcPr>
-            <w:tcW w:w="1901" w:type="dxa"/>
-          </w:tcPr>
-          <w:p>
-            <w:pPr>
-              <w:spacing w:before="120" w:after="120"/>
-              <w:jc w:val="both"/>
-              <w:cnfStyle w:val="000000000000" w:firstRow="0" w:lastRow="0" w:firstColumn="0" w:lastColumn="0" w:oddVBand="0" w:evenVBand="0" w:oddHBand="0" w:evenHBand="0" w:firstRowFirstColumn="0" w:firstRowLastColumn="0" w:lastRowFirstColumn="0" w:lastRowLastColumn="0"/>
-              <w:rPr>
-                <w:color w:val="000000"/>
-                <w:sz w:val="26"/>
-                <w:szCs w:val="26"/>
-              </w:rPr>
-            </w:pPr>
           </w:p>
         </w:tc>
       </w:tr>
@@ -27558,23 +27480,6 @@
             </w:r>
           </w:p>
         </w:tc>
-        <w:tc>
-          <w:tcPr>
-            <w:tcW w:w="1901" w:type="dxa"/>
-          </w:tcPr>
-          <w:p>
-            <w:pPr>
-              <w:spacing w:before="120" w:after="120"/>
-              <w:jc w:val="both"/>
-              <w:cnfStyle w:val="000000100000" w:firstRow="0" w:lastRow="0" w:firstColumn="0" w:lastColumn="0" w:oddVBand="0" w:evenVBand="0" w:oddHBand="1" w:evenHBand="0" w:firstRowFirstColumn="0" w:firstRowLastColumn="0" w:lastRowFirstColumn="0" w:lastRowLastColumn="0"/>
-              <w:rPr>
-                <w:color w:val="000000"/>
-                <w:sz w:val="26"/>
-                <w:szCs w:val="26"/>
-              </w:rPr>
-            </w:pPr>
-          </w:p>
-        </w:tc>
       </w:tr>
       <w:tr>
         <w:trPr>
@@ -27627,33 +27532,8 @@
                 <w:sz w:val="26"/>
                 <w:szCs w:val="26"/>
               </w:rPr>
-              <w:t>10M1</w:t>
-            </w:r>
-            <w:r>
-              <w:rPr>
-                <w:color w:val="000000"/>
-                <w:sz w:val="26"/>
-                <w:szCs w:val="26"/>
-              </w:rPr>
-              <w:t>1</w:t>
-            </w:r>
-          </w:p>
-        </w:tc>
-        <w:tc>
-          <w:tcPr>
-            <w:tcW w:w="1901" w:type="dxa"/>
-          </w:tcPr>
-          <w:p>
-            <w:pPr>
-              <w:spacing w:before="120" w:after="120"/>
-              <w:jc w:val="both"/>
-              <w:cnfStyle w:val="000000000000" w:firstRow="0" w:lastRow="0" w:firstColumn="0" w:lastColumn="0" w:oddVBand="0" w:evenVBand="0" w:oddHBand="0" w:evenHBand="0" w:firstRowFirstColumn="0" w:firstRowLastColumn="0" w:lastRowFirstColumn="0" w:lastRowLastColumn="0"/>
-              <w:rPr>
-                <w:color w:val="000000"/>
-                <w:sz w:val="26"/>
-                <w:szCs w:val="26"/>
-              </w:rPr>
-            </w:pPr>
+              <w:t>10M11</w:t>
+            </w:r>
           </w:p>
         </w:tc>
       </w:tr>
@@ -27713,23 +27593,6 @@
             </w:r>
           </w:p>
         </w:tc>
-        <w:tc>
-          <w:tcPr>
-            <w:tcW w:w="1901" w:type="dxa"/>
-          </w:tcPr>
-          <w:p>
-            <w:pPr>
-              <w:spacing w:before="120" w:after="120"/>
-              <w:jc w:val="both"/>
-              <w:cnfStyle w:val="000000100000" w:firstRow="0" w:lastRow="0" w:firstColumn="0" w:lastColumn="0" w:oddVBand="0" w:evenVBand="0" w:oddHBand="1" w:evenHBand="0" w:firstRowFirstColumn="0" w:firstRowLastColumn="0" w:lastRowFirstColumn="0" w:lastRowLastColumn="0"/>
-              <w:rPr>
-                <w:color w:val="000000"/>
-                <w:sz w:val="26"/>
-                <w:szCs w:val="26"/>
-              </w:rPr>
-            </w:pPr>
-          </w:p>
-        </w:tc>
       </w:tr>
       <w:tr>
         <w:trPr>
@@ -27784,23 +27647,6 @@
               </w:rPr>
               <w:t>58M29</w:t>
             </w:r>
-          </w:p>
-        </w:tc>
-        <w:tc>
-          <w:tcPr>
-            <w:tcW w:w="1901" w:type="dxa"/>
-          </w:tcPr>
-          <w:p>
-            <w:pPr>
-              <w:spacing w:before="120" w:after="120"/>
-              <w:jc w:val="both"/>
-              <w:cnfStyle w:val="000000000000" w:firstRow="0" w:lastRow="0" w:firstColumn="0" w:lastColumn="0" w:oddVBand="0" w:evenVBand="0" w:oddHBand="0" w:evenHBand="0" w:firstRowFirstColumn="0" w:firstRowLastColumn="0" w:lastRowFirstColumn="0" w:lastRowLastColumn="0"/>
-              <w:rPr>
-                <w:color w:val="000000"/>
-                <w:sz w:val="26"/>
-                <w:szCs w:val="26"/>
-              </w:rPr>
-            </w:pPr>
           </w:p>
         </w:tc>
       </w:tr>
@@ -27860,23 +27706,6 @@
             </w:r>
           </w:p>
         </w:tc>
-        <w:tc>
-          <w:tcPr>
-            <w:tcW w:w="1901" w:type="dxa"/>
-          </w:tcPr>
-          <w:p>
-            <w:pPr>
-              <w:spacing w:before="120" w:after="120"/>
-              <w:jc w:val="both"/>
-              <w:cnfStyle w:val="000000100000" w:firstRow="0" w:lastRow="0" w:firstColumn="0" w:lastColumn="0" w:oddVBand="0" w:evenVBand="0" w:oddHBand="1" w:evenHBand="0" w:firstRowFirstColumn="0" w:firstRowLastColumn="0" w:lastRowFirstColumn="0" w:lastRowLastColumn="0"/>
-              <w:rPr>
-                <w:color w:val="000000"/>
-                <w:sz w:val="26"/>
-                <w:szCs w:val="26"/>
-              </w:rPr>
-            </w:pPr>
-          </w:p>
-        </w:tc>
       </w:tr>
       <w:tr>
         <w:trPr>
@@ -27931,24 +27760,6 @@
               </w:rPr>
               <w:t>1M82</w:t>
             </w:r>
-          </w:p>
-        </w:tc>
-        <w:tc>
-          <w:tcPr>
-            <w:tcW w:w="1901" w:type="dxa"/>
-          </w:tcPr>
-          <w:p>
-            <w:pPr>
-              <w:spacing w:before="120" w:after="120"/>
-              <w:jc w:val="both"/>
-              <w:cnfStyle w:val="000000000000" w:firstRow="0" w:lastRow="0" w:firstColumn="0" w:lastColumn="0" w:oddVBand="0" w:evenVBand="0" w:oddHBand="0" w:evenHBand="0" w:firstRowFirstColumn="0" w:firstRowLastColumn="0" w:lastRowFirstColumn="0" w:lastRowLastColumn="0"/>
-              <w:rPr>
-                <w:b/>
-                <w:color w:val="000000"/>
-                <w:sz w:val="26"/>
-                <w:szCs w:val="26"/>
-              </w:rPr>
-            </w:pPr>
           </w:p>
         </w:tc>
       </w:tr>
@@ -28006,24 +27817,6 @@
               </w:rPr>
               <w:t>2M98</w:t>
             </w:r>
-          </w:p>
-        </w:tc>
-        <w:tc>
-          <w:tcPr>
-            <w:tcW w:w="1901" w:type="dxa"/>
-          </w:tcPr>
-          <w:p>
-            <w:pPr>
-              <w:spacing w:before="120" w:after="120"/>
-              <w:jc w:val="both"/>
-              <w:cnfStyle w:val="000000100000" w:firstRow="0" w:lastRow="0" w:firstColumn="0" w:lastColumn="0" w:oddVBand="0" w:evenVBand="0" w:oddHBand="1" w:evenHBand="0" w:firstRowFirstColumn="0" w:firstRowLastColumn="0" w:lastRowFirstColumn="0" w:lastRowLastColumn="0"/>
-              <w:rPr>
-                <w:b/>
-                <w:color w:val="000000"/>
-                <w:sz w:val="26"/>
-                <w:szCs w:val="26"/>
-              </w:rPr>
-            </w:pPr>
           </w:p>
         </w:tc>
       </w:tr>
@@ -32751,7 +32544,7 @@
           <w:sz w:val="26"/>
           <w:szCs w:val="26"/>
         </w:rPr>
-        <w:t>Đối tượng chính của ứng dụng là các nhà nghiên cứu, bác sĩ hoặc chuyên gia tâm lý học cần phân tích cảm xúc khuôn mặt từ hình ảnh hoặc video thời gian thực. Ứng dụng này hỗ trợ nhận diện cảm xúc (Surprise, Fear, Disgust, Happy, Sad, Angry, Neutral) thông qua các mô hình học sâu và kỹ thuật xử lý ảnh tiên tiến, giúp ứng dụng trong nghiên cứu tâm lý, y học hoặc giám sát hành vi.</w:t>
+        <w:t>Ứng dụng web nhận diện cảm xúc khuôn mặt hướng đến nhiều đối tượng sử dụng đa dạng, từ cá nhân, nhà nghiên cứu, doanh nghiệp đến nhà phát triển phần mềm, với mục tiêu khai thác biểu cảm khuôn mặt để phân tích và ứng dụng thực tiễn. Đặc biệt, ứng dụng có thể được triển khai trong các rạp phim để nhận diện phản ứng cảm xúc của khán giả đối với các cảnh phim, giúp nhà sản xuất đánh giá hiệu quả nội dung và điều chỉnh chiến lược quảng bá. Tương tự, trên các biển quảng cáo thông minh, công nghệ này có thể phân tích cảm xúc của người xem khi tiếp cận sản phẩm hoặc thông điệp, từ đó hỗ trợ doanh nghiệp tối ưu hóa chiến dịch marketing, tăng tương tác và cải thiện trải nghiệm khách hàng. Với giao diện thân thiện và tính năng linh hoạt như phân tích thời gian thực hay báo cáo chi tiết, ứng dụng đảm bảo dễ dàng tiếp cận và đáp ứng nhu cầu của nhiều nhóm người dùng khác nhau.</w:t>
       </w:r>
     </w:p>
     <w:p>
@@ -32761,7 +32554,13 @@
       </w:pPr>
       <w:bookmarkStart w:id="527" w:name="_Toc194006519"/>
       <w:r>
-        <w:t>4.4.2 chức năng</w:t>
+        <w:t xml:space="preserve">4.4.2 </w:t>
+      </w:r>
+      <w:r>
+        <w:t>C</w:t>
+      </w:r>
+      <w:r>
+        <w:t>hức năng</w:t>
       </w:r>
       <w:bookmarkEnd w:id="527"/>
     </w:p>
@@ -32804,6 +32603,13 @@
         </w:rPr>
         <w:t>Tải lên hình ảnh để phân tích cảm xúc</w:t>
       </w:r>
+      <w:r>
+        <w:rPr>
+          <w:sz w:val="26"/>
+          <w:szCs w:val="26"/>
+        </w:rPr>
+        <w:t>:</w:t>
+      </w:r>
     </w:p>
     <w:p>
       <w:pPr>
@@ -32896,9 +32702,172 @@
     </w:p>
     <w:p>
       <w:pPr>
+        <w:keepNext/>
         <w:spacing w:before="120" w:after="120"/>
         <w:ind w:firstLine="360"/>
         <w:jc w:val="both"/>
+      </w:pPr>
+      <w:r>
+        <w:rPr>
+          <w:sz w:val="26"/>
+          <w:szCs w:val="26"/>
+        </w:rPr>
+        <w:lastRenderedPageBreak/>
+        <w:drawing>
+          <wp:inline distT="0" distB="0" distL="0" distR="0" wp14:anchorId="6EFA509F" wp14:editId="029D017F">
+            <wp:extent cx="5204911" cy="4701947"/>
+            <wp:effectExtent l="0" t="0" r="0" b="3810"/>
+            <wp:docPr id="1350925782" name="Picture 1" descr="A screenshot of a computer&#10;&#10;AI-generated content may be incorrect."/>
+            <wp:cNvGraphicFramePr>
+              <a:graphicFrameLocks xmlns:a="http://schemas.openxmlformats.org/drawingml/2006/main" noChangeAspect="1"/>
+            </wp:cNvGraphicFramePr>
+            <a:graphic xmlns:a="http://schemas.openxmlformats.org/drawingml/2006/main">
+              <a:graphicData uri="http://schemas.openxmlformats.org/drawingml/2006/picture">
+                <pic:pic xmlns:pic="http://schemas.openxmlformats.org/drawingml/2006/picture">
+                  <pic:nvPicPr>
+                    <pic:cNvPr id="1350925782" name="Picture 1" descr="A screenshot of a computer&#10;&#10;AI-generated content may be incorrect."/>
+                    <pic:cNvPicPr/>
+                  </pic:nvPicPr>
+                  <pic:blipFill>
+                    <a:blip r:embed="rId30"/>
+                    <a:stretch>
+                      <a:fillRect/>
+                    </a:stretch>
+                  </pic:blipFill>
+                  <pic:spPr>
+                    <a:xfrm>
+                      <a:off x="0" y="0"/>
+                      <a:ext cx="5204911" cy="4701947"/>
+                    </a:xfrm>
+                    <a:prstGeom prst="rect">
+                      <a:avLst/>
+                    </a:prstGeom>
+                  </pic:spPr>
+                </pic:pic>
+              </a:graphicData>
+            </a:graphic>
+          </wp:inline>
+        </w:drawing>
+      </w:r>
+    </w:p>
+    <w:p>
+      <w:pPr>
+        <w:pStyle w:val="Caption"/>
+      </w:pPr>
+      <w:r>
+        <w:t xml:space="preserve">Hình </w:t>
+      </w:r>
+      <w:r>
+        <w:fldChar w:fldCharType="begin"/>
+      </w:r>
+      <w:r>
+        <w:instrText xml:space="preserve"> SEQ Hình \* ARABIC </w:instrText>
+      </w:r>
+      <w:r>
+        <w:fldChar w:fldCharType="separate"/>
+      </w:r>
+      <w:r>
+        <w:rPr>
+          <w:noProof/>
+        </w:rPr>
+        <w:t>13</w:t>
+      </w:r>
+      <w:r>
+        <w:fldChar w:fldCharType="end"/>
+      </w:r>
+      <w:r>
+        <w:t xml:space="preserve">: </w:t>
+      </w:r>
+      <w:r>
+        <w:t>Giao diện tải lên ảnh</w:t>
+      </w:r>
+    </w:p>
+    <w:p>
+      <w:pPr>
+        <w:keepNext/>
+      </w:pPr>
+      <w:r>
+        <w:rPr>
+          <w:noProof/>
+        </w:rPr>
+        <w:lastRenderedPageBreak/>
+        <w:drawing>
+          <wp:inline distT="0" distB="0" distL="0" distR="0" wp14:anchorId="45F255A3" wp14:editId="04744119">
+            <wp:extent cx="5258256" cy="6607113"/>
+            <wp:effectExtent l="0" t="0" r="0" b="3810"/>
+            <wp:docPr id="1418490317" name="Picture 3" descr="A screenshot of a computer&#10;&#10;AI-generated content may be incorrect."/>
+            <wp:cNvGraphicFramePr>
+              <a:graphicFrameLocks xmlns:a="http://schemas.openxmlformats.org/drawingml/2006/main" noChangeAspect="1"/>
+            </wp:cNvGraphicFramePr>
+            <a:graphic xmlns:a="http://schemas.openxmlformats.org/drawingml/2006/main">
+              <a:graphicData uri="http://schemas.openxmlformats.org/drawingml/2006/picture">
+                <pic:pic xmlns:pic="http://schemas.openxmlformats.org/drawingml/2006/picture">
+                  <pic:nvPicPr>
+                    <pic:cNvPr id="1418490317" name="Picture 3" descr="A screenshot of a computer&#10;&#10;AI-generated content may be incorrect."/>
+                    <pic:cNvPicPr/>
+                  </pic:nvPicPr>
+                  <pic:blipFill>
+                    <a:blip r:embed="rId31">
+                      <a:extLst>
+                        <a:ext uri="{28A0092B-C50C-407E-A947-70E740481C1C}">
+                          <a14:useLocalDpi xmlns:a14="http://schemas.microsoft.com/office/drawing/2010/main" val="0"/>
+                        </a:ext>
+                      </a:extLst>
+                    </a:blip>
+                    <a:stretch>
+                      <a:fillRect/>
+                    </a:stretch>
+                  </pic:blipFill>
+                  <pic:spPr>
+                    <a:xfrm>
+                      <a:off x="0" y="0"/>
+                      <a:ext cx="5258256" cy="6607113"/>
+                    </a:xfrm>
+                    <a:prstGeom prst="rect">
+                      <a:avLst/>
+                    </a:prstGeom>
+                  </pic:spPr>
+                </pic:pic>
+              </a:graphicData>
+            </a:graphic>
+          </wp:inline>
+        </w:drawing>
+      </w:r>
+    </w:p>
+    <w:p>
+      <w:pPr>
+        <w:pStyle w:val="Caption"/>
+      </w:pPr>
+      <w:r>
+        <w:t xml:space="preserve">Hình </w:t>
+      </w:r>
+      <w:r>
+        <w:fldChar w:fldCharType="begin"/>
+      </w:r>
+      <w:r>
+        <w:instrText xml:space="preserve"> SEQ Hình \* ARABIC </w:instrText>
+      </w:r>
+      <w:r>
+        <w:fldChar w:fldCharType="separate"/>
+      </w:r>
+      <w:r>
+        <w:rPr>
+          <w:noProof/>
+        </w:rPr>
+        <w:t>14</w:t>
+      </w:r>
+      <w:r>
+        <w:fldChar w:fldCharType="end"/>
+      </w:r>
+      <w:r>
+        <w:t>: Trường hợp ảnh hợp lệ</w:t>
+      </w:r>
+    </w:p>
+    <w:p>
+      <w:pPr>
+        <w:spacing w:before="120" w:after="120"/>
+        <w:ind w:firstLine="360"/>
+        <w:jc w:val="both"/>
         <w:rPr>
           <w:sz w:val="26"/>
           <w:szCs w:val="26"/>
@@ -32916,7 +32885,313 @@
           <w:sz w:val="26"/>
           <w:szCs w:val="26"/>
         </w:rPr>
+        <w:t>Kết quả hiển thị</w:t>
+      </w:r>
+    </w:p>
+    <w:p>
+      <w:pPr>
+        <w:spacing w:before="120" w:after="120"/>
+        <w:ind w:firstLine="360"/>
+        <w:jc w:val="both"/>
+        <w:rPr>
+          <w:sz w:val="26"/>
+          <w:szCs w:val="26"/>
+        </w:rPr>
+      </w:pPr>
+      <w:r>
+        <w:rPr>
+          <w:sz w:val="26"/>
+          <w:szCs w:val="26"/>
+        </w:rPr>
+        <w:t xml:space="preserve">+ </w:t>
+      </w:r>
+      <w:r>
+        <w:rPr>
+          <w:sz w:val="26"/>
+          <w:szCs w:val="26"/>
+        </w:rPr>
+        <w:t>Nhãn cảm xúc (ví dụ: "Happy", "Sad").</w:t>
+      </w:r>
+    </w:p>
+    <w:p>
+      <w:pPr>
+        <w:spacing w:before="120" w:after="120"/>
+        <w:ind w:firstLine="360"/>
+        <w:jc w:val="both"/>
+        <w:rPr>
+          <w:sz w:val="26"/>
+          <w:szCs w:val="26"/>
+        </w:rPr>
+      </w:pPr>
+      <w:r>
+        <w:rPr>
+          <w:sz w:val="26"/>
+          <w:szCs w:val="26"/>
+        </w:rPr>
+        <w:t>+</w:t>
+      </w:r>
+      <w:r>
+        <w:rPr>
+          <w:sz w:val="26"/>
+          <w:szCs w:val="26"/>
+        </w:rPr>
+        <w:t xml:space="preserve"> </w:t>
+      </w:r>
+      <w:r>
+        <w:rPr>
+          <w:sz w:val="26"/>
+          <w:szCs w:val="26"/>
+        </w:rPr>
+        <w:t>Xác suất từng lớp cảm xúc dưới dạng thanh tiến trình (progress bar).</w:t>
+      </w:r>
+    </w:p>
+    <w:p/>
+    <w:p>
+      <w:pPr>
+        <w:keepNext/>
+      </w:pPr>
+      <w:r>
+        <w:rPr>
+          <w:noProof/>
+        </w:rPr>
+        <w:lastRenderedPageBreak/>
+        <w:drawing>
+          <wp:inline distT="0" distB="0" distL="0" distR="0" wp14:anchorId="3E990BA2" wp14:editId="5B41232B">
+            <wp:extent cx="5273497" cy="6629975"/>
+            <wp:effectExtent l="0" t="0" r="3810" b="0"/>
+            <wp:docPr id="2138866408" name="Picture 4" descr="A screenshot of a screen shot of a grass field&#10;&#10;AI-generated content may be incorrect."/>
+            <wp:cNvGraphicFramePr>
+              <a:graphicFrameLocks xmlns:a="http://schemas.openxmlformats.org/drawingml/2006/main" noChangeAspect="1"/>
+            </wp:cNvGraphicFramePr>
+            <a:graphic xmlns:a="http://schemas.openxmlformats.org/drawingml/2006/main">
+              <a:graphicData uri="http://schemas.openxmlformats.org/drawingml/2006/picture">
+                <pic:pic xmlns:pic="http://schemas.openxmlformats.org/drawingml/2006/picture">
+                  <pic:nvPicPr>
+                    <pic:cNvPr id="2138866408" name="Picture 4" descr="A screenshot of a screen shot of a grass field&#10;&#10;AI-generated content may be incorrect."/>
+                    <pic:cNvPicPr/>
+                  </pic:nvPicPr>
+                  <pic:blipFill>
+                    <a:blip r:embed="rId32">
+                      <a:extLst>
+                        <a:ext uri="{28A0092B-C50C-407E-A947-70E740481C1C}">
+                          <a14:useLocalDpi xmlns:a14="http://schemas.microsoft.com/office/drawing/2010/main" val="0"/>
+                        </a:ext>
+                      </a:extLst>
+                    </a:blip>
+                    <a:stretch>
+                      <a:fillRect/>
+                    </a:stretch>
+                  </pic:blipFill>
+                  <pic:spPr>
+                    <a:xfrm>
+                      <a:off x="0" y="0"/>
+                      <a:ext cx="5273497" cy="6629975"/>
+                    </a:xfrm>
+                    <a:prstGeom prst="rect">
+                      <a:avLst/>
+                    </a:prstGeom>
+                  </pic:spPr>
+                </pic:pic>
+              </a:graphicData>
+            </a:graphic>
+          </wp:inline>
+        </w:drawing>
+      </w:r>
+    </w:p>
+    <w:p>
+      <w:pPr>
+        <w:pStyle w:val="Caption"/>
+      </w:pPr>
+      <w:r>
+        <w:t xml:space="preserve">Hình </w:t>
+      </w:r>
+      <w:r>
+        <w:fldChar w:fldCharType="begin"/>
+      </w:r>
+      <w:r>
+        <w:instrText xml:space="preserve"> SEQ Hình \* ARABIC </w:instrText>
+      </w:r>
+      <w:r>
+        <w:fldChar w:fldCharType="separate"/>
+      </w:r>
+      <w:r>
+        <w:rPr>
+          <w:noProof/>
+        </w:rPr>
+        <w:t>15</w:t>
+      </w:r>
+      <w:r>
+        <w:fldChar w:fldCharType="end"/>
+      </w:r>
+      <w:r>
+        <w:t>: Trường hợp ảnh không hợp lệ</w:t>
+      </w:r>
+    </w:p>
+    <w:p>
+      <w:pPr>
+        <w:keepNext/>
+        <w:jc w:val="center"/>
+      </w:pPr>
+      <w:r>
+        <w:rPr>
+          <w:noProof/>
+        </w:rPr>
+        <w:lastRenderedPageBreak/>
+        <w:drawing>
+          <wp:inline distT="0" distB="0" distL="0" distR="0" wp14:anchorId="09AD124C" wp14:editId="01D3ACFD">
+            <wp:extent cx="5143946" cy="5006774"/>
+            <wp:effectExtent l="0" t="0" r="0" b="3810"/>
+            <wp:docPr id="67362500" name="Picture 5" descr="A screenshot of a computer&#10;&#10;AI-generated content may be incorrect."/>
+            <wp:cNvGraphicFramePr>
+              <a:graphicFrameLocks xmlns:a="http://schemas.openxmlformats.org/drawingml/2006/main" noChangeAspect="1"/>
+            </wp:cNvGraphicFramePr>
+            <a:graphic xmlns:a="http://schemas.openxmlformats.org/drawingml/2006/main">
+              <a:graphicData uri="http://schemas.openxmlformats.org/drawingml/2006/picture">
+                <pic:pic xmlns:pic="http://schemas.openxmlformats.org/drawingml/2006/picture">
+                  <pic:nvPicPr>
+                    <pic:cNvPr id="67362500" name="Picture 5" descr="A screenshot of a computer&#10;&#10;AI-generated content may be incorrect."/>
+                    <pic:cNvPicPr/>
+                  </pic:nvPicPr>
+                  <pic:blipFill>
+                    <a:blip r:embed="rId33">
+                      <a:extLst>
+                        <a:ext uri="{28A0092B-C50C-407E-A947-70E740481C1C}">
+                          <a14:useLocalDpi xmlns:a14="http://schemas.microsoft.com/office/drawing/2010/main" val="0"/>
+                        </a:ext>
+                      </a:extLst>
+                    </a:blip>
+                    <a:stretch>
+                      <a:fillRect/>
+                    </a:stretch>
+                  </pic:blipFill>
+                  <pic:spPr>
+                    <a:xfrm>
+                      <a:off x="0" y="0"/>
+                      <a:ext cx="5143946" cy="5006774"/>
+                    </a:xfrm>
+                    <a:prstGeom prst="rect">
+                      <a:avLst/>
+                    </a:prstGeom>
+                  </pic:spPr>
+                </pic:pic>
+              </a:graphicData>
+            </a:graphic>
+          </wp:inline>
+        </w:drawing>
+      </w:r>
+    </w:p>
+    <w:p>
+      <w:pPr>
+        <w:pStyle w:val="Caption"/>
+      </w:pPr>
+      <w:r>
+        <w:t xml:space="preserve">Hình </w:t>
+      </w:r>
+      <w:r>
+        <w:fldChar w:fldCharType="begin"/>
+      </w:r>
+      <w:r>
+        <w:instrText xml:space="preserve"> SEQ Hình \* ARABIC </w:instrText>
+      </w:r>
+      <w:r>
+        <w:fldChar w:fldCharType="separate"/>
+      </w:r>
+      <w:r>
+        <w:rPr>
+          <w:noProof/>
+        </w:rPr>
+        <w:t>16</w:t>
+      </w:r>
+      <w:r>
+        <w:fldChar w:fldCharType="end"/>
+      </w:r>
+      <w:r>
+        <w:t xml:space="preserve">: </w:t>
+      </w:r>
+      <w:r>
+        <w:t>Trường hợp ảnh không hợp lệ</w:t>
+      </w:r>
+    </w:p>
+    <w:p>
+      <w:pPr>
+        <w:spacing w:before="120" w:after="120"/>
+        <w:ind w:firstLine="360"/>
+        <w:jc w:val="both"/>
+        <w:rPr>
+          <w:sz w:val="26"/>
+          <w:szCs w:val="26"/>
+        </w:rPr>
+      </w:pPr>
+      <w:r>
+        <w:rPr>
+          <w:sz w:val="26"/>
+          <w:szCs w:val="26"/>
+        </w:rPr>
+        <w:t xml:space="preserve">- </w:t>
+      </w:r>
+      <w:r>
+        <w:rPr>
+          <w:sz w:val="26"/>
+          <w:szCs w:val="26"/>
+        </w:rPr>
+        <w:t>Hệ thống trả về thông báo "Không phát hiện khuôn mặt trong ảnh".</w:t>
+      </w:r>
+    </w:p>
+    <w:p>
+      <w:pPr>
+        <w:spacing w:before="120" w:after="120"/>
+        <w:ind w:firstLine="360"/>
+        <w:jc w:val="both"/>
+        <w:rPr>
+          <w:sz w:val="26"/>
+          <w:szCs w:val="26"/>
+        </w:rPr>
+      </w:pPr>
+      <w:r>
+        <w:rPr>
+          <w:sz w:val="26"/>
+          <w:szCs w:val="26"/>
+        </w:rPr>
+        <w:t xml:space="preserve">- </w:t>
+      </w:r>
+      <w:r>
+        <w:rPr>
+          <w:sz w:val="26"/>
+          <w:szCs w:val="26"/>
+        </w:rPr>
+        <w:t>Trường hợp lỗi khác (định dạng không hỗ trợ, kích thước không hợp lệ), hiển thị thông báo lỗi như "Định dạng file không hợp lệ".</w:t>
+      </w:r>
+    </w:p>
+    <w:p>
+      <w:pPr>
+        <w:spacing w:before="120" w:after="120"/>
+        <w:ind w:firstLine="360"/>
+        <w:jc w:val="both"/>
+        <w:rPr>
+          <w:sz w:val="26"/>
+          <w:szCs w:val="26"/>
+        </w:rPr>
+      </w:pPr>
+      <w:r>
+        <w:rPr>
+          <w:sz w:val="26"/>
+          <w:szCs w:val="26"/>
+        </w:rPr>
+        <w:t xml:space="preserve">- </w:t>
+      </w:r>
+      <w:r>
+        <w:rPr>
+          <w:sz w:val="26"/>
+          <w:szCs w:val="26"/>
+        </w:rPr>
         <w:t>Phân tích cảm xúc thời gian thực qua webcam</w:t>
+      </w:r>
+      <w:r>
+        <w:rPr>
+          <w:sz w:val="26"/>
+          <w:szCs w:val="26"/>
+        </w:rPr>
+        <w:t>:</w:t>
       </w:r>
     </w:p>
     <w:p>
@@ -33067,6 +33342,7 @@
           <w:sz w:val="26"/>
           <w:szCs w:val="26"/>
         </w:rPr>
+        <w:lastRenderedPageBreak/>
         <w:t xml:space="preserve">+ </w:t>
       </w:r>
       <w:r>
@@ -33075,6 +33351,771 @@
           <w:szCs w:val="26"/>
         </w:rPr>
         <w:t>Đối với video thời gian thực: Hiển thị nhãn cảm xúc trực tiếp trên video và thông tin chi tiết trong giao diện.</w:t>
+      </w:r>
+    </w:p>
+    <w:p>
+      <w:pPr>
+        <w:keepNext/>
+        <w:spacing w:before="120" w:after="120"/>
+        <w:ind w:firstLine="360"/>
+        <w:jc w:val="center"/>
+      </w:pPr>
+      <w:r>
+        <w:rPr>
+          <w:noProof/>
+          <w:sz w:val="26"/>
+          <w:szCs w:val="26"/>
+        </w:rPr>
+        <w:drawing>
+          <wp:inline distT="0" distB="0" distL="0" distR="0" wp14:anchorId="598AFB7A" wp14:editId="4021C872">
+            <wp:extent cx="5227773" cy="4709568"/>
+            <wp:effectExtent l="0" t="0" r="0" b="0"/>
+            <wp:docPr id="1581837953" name="Picture 6" descr="A screenshot of a computer&#10;&#10;AI-generated content may be incorrect."/>
+            <wp:cNvGraphicFramePr>
+              <a:graphicFrameLocks xmlns:a="http://schemas.openxmlformats.org/drawingml/2006/main" noChangeAspect="1"/>
+            </wp:cNvGraphicFramePr>
+            <a:graphic xmlns:a="http://schemas.openxmlformats.org/drawingml/2006/main">
+              <a:graphicData uri="http://schemas.openxmlformats.org/drawingml/2006/picture">
+                <pic:pic xmlns:pic="http://schemas.openxmlformats.org/drawingml/2006/picture">
+                  <pic:nvPicPr>
+                    <pic:cNvPr id="1581837953" name="Picture 6" descr="A screenshot of a computer&#10;&#10;AI-generated content may be incorrect."/>
+                    <pic:cNvPicPr/>
+                  </pic:nvPicPr>
+                  <pic:blipFill>
+                    <a:blip r:embed="rId34">
+                      <a:extLst>
+                        <a:ext uri="{28A0092B-C50C-407E-A947-70E740481C1C}">
+                          <a14:useLocalDpi xmlns:a14="http://schemas.microsoft.com/office/drawing/2010/main" val="0"/>
+                        </a:ext>
+                      </a:extLst>
+                    </a:blip>
+                    <a:stretch>
+                      <a:fillRect/>
+                    </a:stretch>
+                  </pic:blipFill>
+                  <pic:spPr>
+                    <a:xfrm>
+                      <a:off x="0" y="0"/>
+                      <a:ext cx="5227773" cy="4709568"/>
+                    </a:xfrm>
+                    <a:prstGeom prst="rect">
+                      <a:avLst/>
+                    </a:prstGeom>
+                  </pic:spPr>
+                </pic:pic>
+              </a:graphicData>
+            </a:graphic>
+          </wp:inline>
+        </w:drawing>
+      </w:r>
+    </w:p>
+    <w:p>
+      <w:pPr>
+        <w:pStyle w:val="Caption"/>
+      </w:pPr>
+      <w:r>
+        <w:t xml:space="preserve">Hình </w:t>
+      </w:r>
+      <w:r>
+        <w:fldChar w:fldCharType="begin"/>
+      </w:r>
+      <w:r>
+        <w:instrText xml:space="preserve"> SEQ Hình \* ARABIC </w:instrText>
+      </w:r>
+      <w:r>
+        <w:fldChar w:fldCharType="separate"/>
+      </w:r>
+      <w:r>
+        <w:rPr>
+          <w:noProof/>
+        </w:rPr>
+        <w:t>17</w:t>
+      </w:r>
+      <w:r>
+        <w:fldChar w:fldCharType="end"/>
+      </w:r>
+      <w:r>
+        <w:t>: Giao diện phần Real-time</w:t>
+      </w:r>
+    </w:p>
+    <w:p>
+      <w:pPr>
+        <w:spacing w:before="120" w:after="120"/>
+        <w:ind w:firstLine="360"/>
+        <w:jc w:val="both"/>
+        <w:rPr>
+          <w:sz w:val="26"/>
+          <w:szCs w:val="26"/>
+        </w:rPr>
+      </w:pPr>
+      <w:r>
+        <w:rPr>
+          <w:sz w:val="26"/>
+          <w:szCs w:val="26"/>
+        </w:rPr>
+        <w:t xml:space="preserve">- </w:t>
+      </w:r>
+      <w:r>
+        <w:rPr>
+          <w:sz w:val="26"/>
+          <w:szCs w:val="26"/>
+        </w:rPr>
+        <w:t>Giao diện gồm các chức năng:</w:t>
+      </w:r>
+    </w:p>
+    <w:p>
+      <w:pPr>
+        <w:spacing w:before="120" w:after="120"/>
+        <w:ind w:firstLine="360"/>
+        <w:jc w:val="both"/>
+        <w:rPr>
+          <w:sz w:val="26"/>
+          <w:szCs w:val="26"/>
+        </w:rPr>
+      </w:pPr>
+      <w:r>
+        <w:rPr>
+          <w:sz w:val="26"/>
+          <w:szCs w:val="26"/>
+        </w:rPr>
+        <w:t xml:space="preserve">+ </w:t>
+      </w:r>
+      <w:r>
+        <w:rPr>
+          <w:sz w:val="26"/>
+          <w:szCs w:val="26"/>
+        </w:rPr>
+        <w:t>Video từ webcam hiển thị trong khung chính.</w:t>
+      </w:r>
+    </w:p>
+    <w:p>
+      <w:pPr>
+        <w:spacing w:before="120" w:after="120"/>
+        <w:ind w:firstLine="360"/>
+        <w:jc w:val="both"/>
+        <w:rPr>
+          <w:sz w:val="26"/>
+          <w:szCs w:val="26"/>
+        </w:rPr>
+      </w:pPr>
+      <w:r>
+        <w:rPr>
+          <w:sz w:val="26"/>
+          <w:szCs w:val="26"/>
+        </w:rPr>
+        <w:t xml:space="preserve">+ </w:t>
+      </w:r>
+      <w:r>
+        <w:rPr>
+          <w:sz w:val="26"/>
+          <w:szCs w:val="26"/>
+        </w:rPr>
+        <w:t>Nút "Start" để bật/tắt webcam.</w:t>
+      </w:r>
+    </w:p>
+    <w:p>
+      <w:pPr>
+        <w:spacing w:before="120" w:after="120"/>
+        <w:ind w:firstLine="360"/>
+        <w:jc w:val="both"/>
+        <w:rPr>
+          <w:sz w:val="26"/>
+          <w:szCs w:val="26"/>
+        </w:rPr>
+      </w:pPr>
+      <w:r>
+        <w:rPr>
+          <w:sz w:val="26"/>
+          <w:szCs w:val="26"/>
+        </w:rPr>
+        <w:t xml:space="preserve">+ </w:t>
+      </w:r>
+      <w:r>
+        <w:rPr>
+          <w:sz w:val="26"/>
+          <w:szCs w:val="26"/>
+        </w:rPr>
+        <w:t>Nút "Switch Camera" và dropdown chọn camera (nếu có nhiều camera).</w:t>
+      </w:r>
+    </w:p>
+    <w:p>
+      <w:pPr>
+        <w:spacing w:before="120" w:after="120"/>
+        <w:ind w:firstLine="360"/>
+        <w:jc w:val="both"/>
+        <w:rPr>
+          <w:sz w:val="26"/>
+          <w:szCs w:val="26"/>
+        </w:rPr>
+      </w:pPr>
+      <w:r>
+        <w:rPr>
+          <w:sz w:val="26"/>
+          <w:szCs w:val="26"/>
+        </w:rPr>
+        <w:t xml:space="preserve">+ </w:t>
+      </w:r>
+      <w:r>
+        <w:rPr>
+          <w:sz w:val="26"/>
+          <w:szCs w:val="26"/>
+        </w:rPr>
+        <w:t>Canvas chồng lên video để vẽ nhãn cảm xúc.</w:t>
+      </w:r>
+    </w:p>
+    <w:p>
+      <w:pPr>
+        <w:keepNext/>
+      </w:pPr>
+      <w:r>
+        <w:rPr>
+          <w:noProof/>
+        </w:rPr>
+        <w:lastRenderedPageBreak/>
+        <w:drawing>
+          <wp:inline distT="0" distB="0" distL="0" distR="0" wp14:anchorId="543570D9" wp14:editId="45F62B0E">
+            <wp:extent cx="5433531" cy="6111770"/>
+            <wp:effectExtent l="0" t="0" r="0" b="3810"/>
+            <wp:docPr id="250244764" name="Picture 8" descr="A screenshot of a person's face&#10;&#10;AI-generated content may be incorrect."/>
+            <wp:cNvGraphicFramePr>
+              <a:graphicFrameLocks xmlns:a="http://schemas.openxmlformats.org/drawingml/2006/main" noChangeAspect="1"/>
+            </wp:cNvGraphicFramePr>
+            <a:graphic xmlns:a="http://schemas.openxmlformats.org/drawingml/2006/main">
+              <a:graphicData uri="http://schemas.openxmlformats.org/drawingml/2006/picture">
+                <pic:pic xmlns:pic="http://schemas.openxmlformats.org/drawingml/2006/picture">
+                  <pic:nvPicPr>
+                    <pic:cNvPr id="250244764" name="Picture 8" descr="A screenshot of a person's face&#10;&#10;AI-generated content may be incorrect."/>
+                    <pic:cNvPicPr/>
+                  </pic:nvPicPr>
+                  <pic:blipFill>
+                    <a:blip r:embed="rId35">
+                      <a:extLst>
+                        <a:ext uri="{28A0092B-C50C-407E-A947-70E740481C1C}">
+                          <a14:useLocalDpi xmlns:a14="http://schemas.microsoft.com/office/drawing/2010/main" val="0"/>
+                        </a:ext>
+                      </a:extLst>
+                    </a:blip>
+                    <a:stretch>
+                      <a:fillRect/>
+                    </a:stretch>
+                  </pic:blipFill>
+                  <pic:spPr>
+                    <a:xfrm>
+                      <a:off x="0" y="0"/>
+                      <a:ext cx="5433531" cy="6111770"/>
+                    </a:xfrm>
+                    <a:prstGeom prst="rect">
+                      <a:avLst/>
+                    </a:prstGeom>
+                  </pic:spPr>
+                </pic:pic>
+              </a:graphicData>
+            </a:graphic>
+          </wp:inline>
+        </w:drawing>
+      </w:r>
+    </w:p>
+    <w:p>
+      <w:pPr>
+        <w:pStyle w:val="Caption"/>
+      </w:pPr>
+      <w:r>
+        <w:t xml:space="preserve">Hình </w:t>
+      </w:r>
+      <w:r>
+        <w:fldChar w:fldCharType="begin"/>
+      </w:r>
+      <w:r>
+        <w:instrText xml:space="preserve"> SEQ Hình \* ARABIC </w:instrText>
+      </w:r>
+      <w:r>
+        <w:fldChar w:fldCharType="separate"/>
+      </w:r>
+      <w:r>
+        <w:rPr>
+          <w:noProof/>
+        </w:rPr>
+        <w:t>18</w:t>
+      </w:r>
+      <w:r>
+        <w:fldChar w:fldCharType="end"/>
+      </w:r>
+      <w:r>
+        <w:t>: Trường hợp tìm thấy khuôn mặt</w:t>
+      </w:r>
+    </w:p>
+    <w:p>
+      <w:pPr>
+        <w:spacing w:before="120" w:after="120"/>
+        <w:ind w:firstLine="360"/>
+        <w:jc w:val="both"/>
+        <w:rPr>
+          <w:sz w:val="26"/>
+          <w:szCs w:val="26"/>
+        </w:rPr>
+      </w:pPr>
+      <w:r>
+        <w:rPr>
+          <w:sz w:val="26"/>
+          <w:szCs w:val="26"/>
+        </w:rPr>
+        <w:t xml:space="preserve">- </w:t>
+      </w:r>
+      <w:r>
+        <w:rPr>
+          <w:sz w:val="26"/>
+          <w:szCs w:val="26"/>
+        </w:rPr>
+        <w:t>Khi webcam ghi nhận khuôn mặt:</w:t>
+      </w:r>
+    </w:p>
+    <w:p>
+      <w:pPr>
+        <w:spacing w:before="120" w:after="120"/>
+        <w:ind w:firstLine="360"/>
+        <w:jc w:val="both"/>
+        <w:rPr>
+          <w:sz w:val="26"/>
+          <w:szCs w:val="26"/>
+        </w:rPr>
+      </w:pPr>
+      <w:r>
+        <w:rPr>
+          <w:sz w:val="26"/>
+          <w:szCs w:val="26"/>
+        </w:rPr>
+        <w:t xml:space="preserve">+ </w:t>
+      </w:r>
+      <w:r>
+        <w:rPr>
+          <w:sz w:val="26"/>
+          <w:szCs w:val="26"/>
+        </w:rPr>
+        <w:t xml:space="preserve">Hệ thống xử lý từng frame (200ms/frame) bằng MediaPipe để phát hiện khuôn mặt, sau đó dự đoán cảm xúc bằng mô hình </w:t>
+      </w:r>
+      <w:r>
+        <w:rPr>
+          <w:sz w:val="26"/>
+          <w:szCs w:val="26"/>
+        </w:rPr>
+        <w:t>EfficientNetB4</w:t>
+      </w:r>
+      <w:r>
+        <w:rPr>
+          <w:sz w:val="26"/>
+          <w:szCs w:val="26"/>
+        </w:rPr>
+        <w:t>.</w:t>
+      </w:r>
+    </w:p>
+    <w:p>
+      <w:pPr>
+        <w:spacing w:before="120" w:after="120"/>
+        <w:ind w:firstLine="360"/>
+        <w:jc w:val="both"/>
+        <w:rPr>
+          <w:sz w:val="26"/>
+          <w:szCs w:val="26"/>
+        </w:rPr>
+      </w:pPr>
+      <w:r>
+        <w:rPr>
+          <w:sz w:val="26"/>
+          <w:szCs w:val="26"/>
+        </w:rPr>
+        <w:t xml:space="preserve">- </w:t>
+      </w:r>
+      <w:r>
+        <w:rPr>
+          <w:sz w:val="26"/>
+          <w:szCs w:val="26"/>
+        </w:rPr>
+        <w:t>Kết quả hiện thị bao gồm:</w:t>
+      </w:r>
+    </w:p>
+    <w:p>
+      <w:pPr>
+        <w:spacing w:before="120" w:after="120"/>
+        <w:ind w:firstLine="360"/>
+        <w:jc w:val="both"/>
+        <w:rPr>
+          <w:sz w:val="26"/>
+          <w:szCs w:val="26"/>
+        </w:rPr>
+      </w:pPr>
+      <w:r>
+        <w:rPr>
+          <w:sz w:val="26"/>
+          <w:szCs w:val="26"/>
+        </w:rPr>
+        <w:t xml:space="preserve">+ </w:t>
+      </w:r>
+      <w:r>
+        <w:rPr>
+          <w:sz w:val="26"/>
+          <w:szCs w:val="26"/>
+        </w:rPr>
+        <w:t>Bounding box màu xanh quanh khuôn mặt.</w:t>
+      </w:r>
+    </w:p>
+    <w:p>
+      <w:pPr>
+        <w:spacing w:before="120" w:after="120"/>
+        <w:ind w:firstLine="360"/>
+        <w:jc w:val="both"/>
+        <w:rPr>
+          <w:sz w:val="26"/>
+          <w:szCs w:val="26"/>
+        </w:rPr>
+      </w:pPr>
+      <w:r>
+        <w:rPr>
+          <w:sz w:val="26"/>
+          <w:szCs w:val="26"/>
+        </w:rPr>
+        <w:t xml:space="preserve">+ </w:t>
+      </w:r>
+      <w:r>
+        <w:rPr>
+          <w:sz w:val="26"/>
+          <w:szCs w:val="26"/>
+        </w:rPr>
+        <w:t>Nhãn cảm xúc (ví dụ: "</w:t>
+      </w:r>
+      <w:r>
+        <w:rPr>
+          <w:sz w:val="26"/>
+          <w:szCs w:val="26"/>
+        </w:rPr>
+        <w:t>Neutral</w:t>
+      </w:r>
+      <w:r>
+        <w:rPr>
+          <w:sz w:val="26"/>
+          <w:szCs w:val="26"/>
+        </w:rPr>
+        <w:t>") hiển thị phía trên bounding box.</w:t>
+      </w:r>
+    </w:p>
+    <w:p>
+      <w:pPr>
+        <w:spacing w:before="120" w:after="120"/>
+        <w:ind w:firstLine="360"/>
+        <w:jc w:val="both"/>
+        <w:rPr>
+          <w:sz w:val="26"/>
+          <w:szCs w:val="26"/>
+        </w:rPr>
+      </w:pPr>
+      <w:r>
+        <w:rPr>
+          <w:sz w:val="26"/>
+          <w:szCs w:val="26"/>
+        </w:rPr>
+        <w:t xml:space="preserve">+ </w:t>
+      </w:r>
+      <w:r>
+        <w:rPr>
+          <w:sz w:val="26"/>
+          <w:szCs w:val="26"/>
+        </w:rPr>
+        <w:t xml:space="preserve">Danh sách cảm xúc chi tiết trong khu vực kết quả (ví dụ: "Face 1: </w:t>
+      </w:r>
+      <w:r>
+        <w:rPr>
+          <w:sz w:val="26"/>
+          <w:szCs w:val="26"/>
+        </w:rPr>
+        <w:t>Neutral</w:t>
+      </w:r>
+      <w:r>
+        <w:rPr>
+          <w:sz w:val="26"/>
+          <w:szCs w:val="26"/>
+        </w:rPr>
+        <w:t xml:space="preserve"> </w:t>
+      </w:r>
+      <w:r>
+        <w:rPr>
+          <w:sz w:val="26"/>
+          <w:szCs w:val="26"/>
+        </w:rPr>
+        <w:t>").</w:t>
+      </w:r>
+    </w:p>
+    <w:p>
+      <w:pPr>
+        <w:keepNext/>
+        <w:spacing w:before="120" w:after="120"/>
+        <w:ind w:firstLine="360"/>
+        <w:jc w:val="both"/>
+      </w:pPr>
+      <w:r>
+        <w:rPr>
+          <w:noProof/>
+          <w:sz w:val="26"/>
+          <w:szCs w:val="26"/>
+        </w:rPr>
+        <w:lastRenderedPageBreak/>
+        <w:drawing>
+          <wp:inline distT="0" distB="0" distL="0" distR="0" wp14:anchorId="3C719FC3" wp14:editId="04E31362">
+            <wp:extent cx="5349704" cy="6066046"/>
+            <wp:effectExtent l="0" t="0" r="3810" b="0"/>
+            <wp:docPr id="1445678167" name="Picture 9" descr="A screenshot of a screen&#10;&#10;AI-generated content may be incorrect."/>
+            <wp:cNvGraphicFramePr>
+              <a:graphicFrameLocks xmlns:a="http://schemas.openxmlformats.org/drawingml/2006/main" noChangeAspect="1"/>
+            </wp:cNvGraphicFramePr>
+            <a:graphic xmlns:a="http://schemas.openxmlformats.org/drawingml/2006/main">
+              <a:graphicData uri="http://schemas.openxmlformats.org/drawingml/2006/picture">
+                <pic:pic xmlns:pic="http://schemas.openxmlformats.org/drawingml/2006/picture">
+                  <pic:nvPicPr>
+                    <pic:cNvPr id="1445678167" name="Picture 9" descr="A screenshot of a screen&#10;&#10;AI-generated content may be incorrect."/>
+                    <pic:cNvPicPr/>
+                  </pic:nvPicPr>
+                  <pic:blipFill>
+                    <a:blip r:embed="rId36">
+                      <a:extLst>
+                        <a:ext uri="{28A0092B-C50C-407E-A947-70E740481C1C}">
+                          <a14:useLocalDpi xmlns:a14="http://schemas.microsoft.com/office/drawing/2010/main" val="0"/>
+                        </a:ext>
+                      </a:extLst>
+                    </a:blip>
+                    <a:stretch>
+                      <a:fillRect/>
+                    </a:stretch>
+                  </pic:blipFill>
+                  <pic:spPr>
+                    <a:xfrm>
+                      <a:off x="0" y="0"/>
+                      <a:ext cx="5349704" cy="6066046"/>
+                    </a:xfrm>
+                    <a:prstGeom prst="rect">
+                      <a:avLst/>
+                    </a:prstGeom>
+                  </pic:spPr>
+                </pic:pic>
+              </a:graphicData>
+            </a:graphic>
+          </wp:inline>
+        </w:drawing>
+      </w:r>
+    </w:p>
+    <w:p>
+      <w:pPr>
+        <w:pStyle w:val="Caption"/>
+        <w:rPr>
+          <w:sz w:val="26"/>
+        </w:rPr>
+      </w:pPr>
+      <w:r>
+        <w:t xml:space="preserve">Hình </w:t>
+      </w:r>
+      <w:r>
+        <w:fldChar w:fldCharType="begin"/>
+      </w:r>
+      <w:r>
+        <w:instrText xml:space="preserve"> SEQ Hình \* ARABIC </w:instrText>
+      </w:r>
+      <w:r>
+        <w:fldChar w:fldCharType="separate"/>
+      </w:r>
+      <w:r>
+        <w:rPr>
+          <w:noProof/>
+        </w:rPr>
+        <w:t>19</w:t>
+      </w:r>
+      <w:r>
+        <w:fldChar w:fldCharType="end"/>
+      </w:r>
+      <w:r>
+        <w:t>: Trường hợp không tìm thấy khuôn mặt</w:t>
+      </w:r>
+    </w:p>
+    <w:p>
+      <w:pPr>
+        <w:spacing w:before="120" w:after="120"/>
+        <w:ind w:firstLine="360"/>
+        <w:jc w:val="both"/>
+        <w:rPr>
+          <w:sz w:val="26"/>
+          <w:szCs w:val="26"/>
+        </w:rPr>
+      </w:pPr>
+      <w:r>
+        <w:rPr>
+          <w:sz w:val="26"/>
+          <w:szCs w:val="26"/>
+        </w:rPr>
+        <w:t xml:space="preserve">- </w:t>
+      </w:r>
+      <w:r>
+        <w:rPr>
+          <w:sz w:val="26"/>
+          <w:szCs w:val="26"/>
+        </w:rPr>
+        <w:t>Nếu không có khuôn mặt trong khung hình:</w:t>
+      </w:r>
+    </w:p>
+    <w:p>
+      <w:pPr>
+        <w:spacing w:before="120" w:after="120"/>
+        <w:ind w:firstLine="360"/>
+        <w:jc w:val="both"/>
+        <w:rPr>
+          <w:sz w:val="26"/>
+          <w:szCs w:val="26"/>
+        </w:rPr>
+      </w:pPr>
+      <w:r>
+        <w:rPr>
+          <w:sz w:val="26"/>
+          <w:szCs w:val="26"/>
+        </w:rPr>
+        <w:t xml:space="preserve">+ </w:t>
+      </w:r>
+      <w:r>
+        <w:rPr>
+          <w:sz w:val="26"/>
+          <w:szCs w:val="26"/>
+        </w:rPr>
+        <w:t>Hệ thống hiển thị thông báo "Không phát hiện khuôn mặt" trong khu vực kết quả.</w:t>
+      </w:r>
+    </w:p>
+    <w:p>
+      <w:pPr>
+        <w:spacing w:before="120" w:after="120"/>
+        <w:ind w:firstLine="360"/>
+        <w:jc w:val="both"/>
+        <w:rPr>
+          <w:sz w:val="26"/>
+          <w:szCs w:val="26"/>
+        </w:rPr>
+      </w:pPr>
+      <w:r>
+        <w:rPr>
+          <w:sz w:val="26"/>
+          <w:szCs w:val="26"/>
+        </w:rPr>
+        <w:t xml:space="preserve">+ </w:t>
+      </w:r>
+      <w:r>
+        <w:rPr>
+          <w:sz w:val="26"/>
+          <w:szCs w:val="26"/>
+        </w:rPr>
+        <w:t>Canvas video không hiển thị bounding box hay nhãn cảm xúc.</w:t>
+      </w:r>
+    </w:p>
+    <w:p>
+      <w:pPr>
+        <w:keepNext/>
+        <w:spacing w:before="120" w:after="120"/>
+        <w:ind w:firstLine="360"/>
+        <w:jc w:val="both"/>
+      </w:pPr>
+      <w:r>
+        <w:rPr>
+          <w:noProof/>
+          <w:sz w:val="26"/>
+          <w:szCs w:val="26"/>
+        </w:rPr>
+        <w:lastRenderedPageBreak/>
+        <w:drawing>
+          <wp:inline distT="0" distB="0" distL="0" distR="0" wp14:anchorId="75D8A9BC" wp14:editId="0BC1A43B">
+            <wp:extent cx="5342083" cy="5044877"/>
+            <wp:effectExtent l="0" t="0" r="0" b="3810"/>
+            <wp:docPr id="992489636" name="Picture 10" descr="A screenshot of a video chat&#10;&#10;AI-generated content may be incorrect."/>
+            <wp:cNvGraphicFramePr>
+              <a:graphicFrameLocks xmlns:a="http://schemas.openxmlformats.org/drawingml/2006/main" noChangeAspect="1"/>
+            </wp:cNvGraphicFramePr>
+            <a:graphic xmlns:a="http://schemas.openxmlformats.org/drawingml/2006/main">
+              <a:graphicData uri="http://schemas.openxmlformats.org/drawingml/2006/picture">
+                <pic:pic xmlns:pic="http://schemas.openxmlformats.org/drawingml/2006/picture">
+                  <pic:nvPicPr>
+                    <pic:cNvPr id="992489636" name="Picture 10" descr="A screenshot of a video chat&#10;&#10;AI-generated content may be incorrect."/>
+                    <pic:cNvPicPr/>
+                  </pic:nvPicPr>
+                  <pic:blipFill>
+                    <a:blip r:embed="rId37">
+                      <a:extLst>
+                        <a:ext uri="{28A0092B-C50C-407E-A947-70E740481C1C}">
+                          <a14:useLocalDpi xmlns:a14="http://schemas.microsoft.com/office/drawing/2010/main" val="0"/>
+                        </a:ext>
+                      </a:extLst>
+                    </a:blip>
+                    <a:stretch>
+                      <a:fillRect/>
+                    </a:stretch>
+                  </pic:blipFill>
+                  <pic:spPr>
+                    <a:xfrm>
+                      <a:off x="0" y="0"/>
+                      <a:ext cx="5342083" cy="5044877"/>
+                    </a:xfrm>
+                    <a:prstGeom prst="rect">
+                      <a:avLst/>
+                    </a:prstGeom>
+                  </pic:spPr>
+                </pic:pic>
+              </a:graphicData>
+            </a:graphic>
+          </wp:inline>
+        </w:drawing>
+      </w:r>
+    </w:p>
+    <w:p>
+      <w:pPr>
+        <w:pStyle w:val="Caption"/>
+      </w:pPr>
+      <w:r>
+        <w:t xml:space="preserve">Hình </w:t>
+      </w:r>
+      <w:r>
+        <w:fldChar w:fldCharType="begin"/>
+      </w:r>
+      <w:r>
+        <w:instrText xml:space="preserve"> SEQ Hình \* ARABIC </w:instrText>
+      </w:r>
+      <w:r>
+        <w:fldChar w:fldCharType="separate"/>
+      </w:r>
+      <w:r>
+        <w:rPr>
+          <w:noProof/>
+        </w:rPr>
+        <w:t>20</w:t>
+      </w:r>
+      <w:r>
+        <w:fldChar w:fldCharType="end"/>
+      </w:r>
+      <w:r>
+        <w:t>: Trường hợp Camera lỗi</w:t>
+      </w:r>
+    </w:p>
+    <w:p>
+      <w:pPr>
+        <w:spacing w:before="120" w:after="120"/>
+        <w:ind w:firstLine="360"/>
+        <w:jc w:val="both"/>
+        <w:rPr>
+          <w:sz w:val="26"/>
+          <w:szCs w:val="26"/>
+        </w:rPr>
+      </w:pPr>
+      <w:r>
+        <w:rPr>
+          <w:sz w:val="26"/>
+          <w:szCs w:val="26"/>
+        </w:rPr>
+        <w:t xml:space="preserve">- </w:t>
+      </w:r>
+      <w:r>
+        <w:rPr>
+          <w:sz w:val="26"/>
+          <w:szCs w:val="26"/>
+        </w:rPr>
+        <w:t>Nếu Camera lỗi hiển thị thông báo lỗi.</w:t>
       </w:r>
     </w:p>
     <w:p>
@@ -33092,10 +34133,126 @@
       <w:bookmarkEnd w:id="528"/>
     </w:p>
     <w:p>
-      <w:r>
-        <w:t xml:space="preserve">- Trang chủ hệ thống </w:t>
-      </w:r>
-    </w:p>
+      <w:pPr>
+        <w:spacing w:before="120" w:after="120"/>
+        <w:ind w:firstLine="360"/>
+        <w:jc w:val="both"/>
+        <w:rPr>
+          <w:sz w:val="26"/>
+          <w:szCs w:val="26"/>
+        </w:rPr>
+      </w:pPr>
+      <w:r>
+        <w:rPr>
+          <w:sz w:val="26"/>
+          <w:szCs w:val="26"/>
+        </w:rPr>
+        <w:t xml:space="preserve">- </w:t>
+      </w:r>
+      <w:r>
+        <w:rPr>
+          <w:sz w:val="26"/>
+          <w:szCs w:val="26"/>
+        </w:rPr>
+        <w:t>Ứng dụng sử dụng mô hình EfficientNetB4 với 7 lớp cảm xúc (Surprise, Fear, Disgust, Happy, Sad, Angry, Neutral), được huấn luyện trước và tải từ file "</w:t>
+      </w:r>
+      <w:r>
+        <w:rPr>
+          <w:sz w:val="26"/>
+          <w:szCs w:val="26"/>
+        </w:rPr>
+        <w:t xml:space="preserve"> </w:t>
+      </w:r>
+      <w:r>
+        <w:rPr>
+          <w:sz w:val="26"/>
+          <w:szCs w:val="26"/>
+        </w:rPr>
+        <w:t>EfficientNetB4 _f1.pth".</w:t>
+      </w:r>
+    </w:p>
+    <w:p>
+      <w:pPr>
+        <w:spacing w:before="120" w:after="120"/>
+        <w:ind w:firstLine="360"/>
+        <w:jc w:val="both"/>
+        <w:rPr>
+          <w:sz w:val="26"/>
+          <w:szCs w:val="26"/>
+        </w:rPr>
+      </w:pPr>
+      <w:r>
+        <w:rPr>
+          <w:sz w:val="26"/>
+          <w:szCs w:val="26"/>
+        </w:rPr>
+        <w:t xml:space="preserve">- </w:t>
+      </w:r>
+      <w:r>
+        <w:rPr>
+          <w:sz w:val="26"/>
+          <w:szCs w:val="26"/>
+        </w:rPr>
+        <w:t>Phát hiện khuôn mặt bằng MediaPipe Face Mesh (tối đa 100 khuôn mặt, ngưỡng tin cậy 0.5) hoặc dự phòng bằng Haar Cascade nếu MediaPipe không hoạt động.</w:t>
+      </w:r>
+    </w:p>
+    <w:p>
+      <w:pPr>
+        <w:spacing w:before="120" w:after="120"/>
+        <w:ind w:firstLine="360"/>
+        <w:jc w:val="both"/>
+        <w:rPr>
+          <w:sz w:val="26"/>
+          <w:szCs w:val="26"/>
+        </w:rPr>
+      </w:pPr>
+      <w:r>
+        <w:rPr>
+          <w:sz w:val="26"/>
+          <w:szCs w:val="26"/>
+        </w:rPr>
+        <w:t xml:space="preserve">- </w:t>
+      </w:r>
+      <w:r>
+        <w:rPr>
+          <w:sz w:val="26"/>
+          <w:szCs w:val="26"/>
+        </w:rPr>
+        <w:t>Xử lý thời gian thực được tối ưu bằng hàng đợi (queue) và luồng xử lý riêng (threading), đảm bảo không làm gián đoạn giao diện người dùng.</w:t>
+      </w:r>
+    </w:p>
+    <w:p>
+      <w:pPr>
+        <w:spacing w:before="120" w:after="120"/>
+        <w:ind w:firstLine="360"/>
+        <w:jc w:val="both"/>
+        <w:rPr>
+          <w:sz w:val="26"/>
+          <w:szCs w:val="26"/>
+        </w:rPr>
+      </w:pPr>
+      <w:r>
+        <w:rPr>
+          <w:sz w:val="26"/>
+          <w:szCs w:val="26"/>
+        </w:rPr>
+        <w:t xml:space="preserve">- </w:t>
+      </w:r>
+      <w:r>
+        <w:rPr>
+          <w:sz w:val="26"/>
+          <w:szCs w:val="26"/>
+        </w:rPr>
+        <w:t>Kết quả được gửi qua SocketIO cho chế độ thời gian thực, đảm bảo phản hồi nhanh với độ trễ thấp.</w:t>
+      </w:r>
+    </w:p>
+    <w:p/>
+    <w:p>
+      <w:pPr>
+        <w:keepNext/>
+      </w:pPr>
+    </w:p>
+    <w:p/>
     <w:p>
       <w:pPr>
         <w:rPr>
@@ -33135,7 +34292,6 @@
       </w:r>
       <w:bookmarkEnd w:id="529"/>
     </w:p>
-    <w:p/>
     <w:p>
       <w:pPr>
         <w:spacing w:before="120" w:after="120"/>
@@ -33151,14 +34307,66 @@
           <w:sz w:val="26"/>
           <w:szCs w:val="26"/>
         </w:rPr>
-        <w:t>Viết tổng kết</w:t>
-      </w:r>
-      <w:r>
-        <w:rPr>
-          <w:sz w:val="26"/>
-          <w:szCs w:val="26"/>
-        </w:rPr>
-        <w:t xml:space="preserve">. </w:t>
+        <w:t>Chương 4 đã trình bày chi tiết quá trình kiểm thử và đánh giá hiệu suất của các mô hình học sâu trong bài toán nhận diện cảm xúc khuôn mặt, sử dụng ba tập dữ liệu RAF-DB, FER-2013 và CK+. Môi trường thực nghiệm được thiết lập trên nền tảng Kaggle với cấu hình GPU T4x2, đảm bảo khả năng xử lý hiệu quả cho các mô hình phức tạp. Các độ đo đánh giá như Accuracy, Precision, Recall và F1-score đã được áp dụng để so sánh hiệu suất của các mô hình, bao gồm DenseNet, EfficientNet, MobileNet, ResNet. Kết quả kiểm thử cho thấy EfficientNet</w:t>
+      </w:r>
+      <w:r>
+        <w:rPr>
+          <w:sz w:val="26"/>
+          <w:szCs w:val="26"/>
+        </w:rPr>
+        <w:t xml:space="preserve">B4 </w:t>
+      </w:r>
+      <w:r>
+        <w:rPr>
+          <w:sz w:val="26"/>
+          <w:szCs w:val="26"/>
+        </w:rPr>
+        <w:t>đạt độ chính xác cao nhất trên RAF-DB (</w:t>
+      </w:r>
+      <w:r>
+        <w:t>0.8461</w:t>
+      </w:r>
+      <w:r>
+        <w:rPr>
+          <w:sz w:val="26"/>
+          <w:szCs w:val="26"/>
+        </w:rPr>
+        <w:t>) và FER-2013 (0.</w:t>
+      </w:r>
+      <w:r>
+        <w:rPr>
+          <w:b/>
+          <w:bCs/>
+        </w:rPr>
+        <w:t xml:space="preserve"> </w:t>
+      </w:r>
+      <w:r>
+        <w:t>6924</w:t>
+      </w:r>
+      <w:r>
+        <w:rPr>
+          <w:sz w:val="26"/>
+          <w:szCs w:val="26"/>
+        </w:rPr>
+        <w:t>), trong khi MobileNetV2 nổi bật với sự cân bằng giữa các chỉ số và tính ứng dụng cao nhờ thiết kế nhẹ. Trên tập CK+, các mô hình huấn luyện từ RAF-DB và FER-2013 cũng thể hiện khả năng tổng quát hóa tốt, với EfficientNetB3 đạt độ chính xác cao nhất (0.8559) khi huấn luyện trên FER-2013.</w:t>
+      </w:r>
+    </w:p>
+    <w:p>
+      <w:pPr>
+        <w:spacing w:before="120" w:after="120"/>
+        <w:ind w:firstLine="425"/>
+        <w:jc w:val="both"/>
+        <w:rPr>
+          <w:sz w:val="26"/>
+          <w:szCs w:val="26"/>
+        </w:rPr>
+      </w:pPr>
+      <w:r>
+        <w:rPr>
+          <w:sz w:val="26"/>
+          <w:szCs w:val="26"/>
+        </w:rPr>
+        <w:t>Bên cạnh đó, phần thảo luận đã phân tích mối quan hệ giữa số lượng tham số và hiệu suất của các mô hình, đồng thời so sánh với các nghiên cứu trước, khẳng định sự cải tiến của phương pháp đề xuất, đặc biệt với ViT và EfficientNetB4 trên RAF-DB (0.85 và 0.84) so với CLCM (0.84) của Gursesli và cộng sự [24]. Ứng dụng web được phát triển với các chức năng như phân tích cảm xúc từ ảnh tĩnh và video thời gian thực, sử dụng EfficientNetB4 và MediaPipe, đáp ứng nhu cầu đa dạng của các đối tượng sử dụng từ cá nhân, doanh nghiệp đến nhà nghiên cứu. Giao diện thân thiện cùng khả năng xử lý nhanh đã được tối ưu, mang lại kết quả trực quan và hiệu quả. Chương này không chỉ đánh giá toàn diện hiệu suất mô hình mà còn khẳng định tính thực tiễn của giải pháp trong các ứng dụng thực tế như rạp phim và biển quảng cáo thông minh.</w:t>
       </w:r>
       <w:r>
         <w:rPr>
@@ -34488,7 +35696,7 @@
       </w:pPr>
     </w:p>
     <w:sectPr>
-      <w:headerReference w:type="default" r:id="rId30"/>
+      <w:headerReference w:type="default" r:id="rId38"/>
       <w:pgSz w:w="11906" w:h="16838"/>
       <w:pgMar w:top="1440" w:right="1138" w:bottom="1699" w:left="1985" w:header="720" w:footer="720" w:gutter="0"/>
       <w:cols w:space="720"/>
@@ -37160,7 +38368,7 @@
   <w:style w:type="paragraph" w:default="1" w:styleId="Normal">
     <w:name w:val="Normal"/>
     <w:qFormat/>
-    <w:rsid w:val="00C318A4"/>
+    <w:rsid w:val="00C251C2"/>
   </w:style>
   <w:style w:type="paragraph" w:styleId="Heading1">
     <w:name w:val="heading 1"/>
@@ -38057,7 +39265,7 @@
     <w:next w:val="Normal"/>
     <w:autoRedefine/>
     <w:qFormat/>
-    <w:rsid w:val="003F145C"/>
+    <w:rsid w:val="002F70E8"/>
     <w:pPr>
       <w:keepNext/>
       <w:tabs>
@@ -39632,28 +40840,28 @@
 </file>
 
 <file path=customXml/item1.xml><?xml version="1.0" encoding="utf-8"?>
-<b:Sources xmlns:b="http://schemas.openxmlformats.org/officeDocument/2006/bibliography" xmlns="http://schemas.openxmlformats.org/officeDocument/2006/bibliography" SelectedStyle="\APASixthEditionOfficeOnline.xsl" StyleName="APA" Version="6"/>
-</file>
-
-<file path=customXml/item2.xml><?xml version="1.0" encoding="utf-8"?>
 <go:gDocsCustomXmlDataStorage xmlns:go="http://customooxmlschemas.google.com/" xmlns:r="http://schemas.openxmlformats.org/officeDocument/2006/relationships" uri="GoogleDocsCustomDataVersion2">
   <go:docsCustomData xmlns:go="http://customooxmlschemas.google.com/" roundtripDataSignature="AMtx7mirUMg8LuMSpLc0qa0cphsuGzfkEw==">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</go:docsCustomData>
 </go:gDocsCustomXmlDataStorage>
 </file>
 
-<file path=customXml/itemProps1.xml><?xml version="1.0" encoding="utf-8"?>
-<ds:datastoreItem xmlns:ds="http://schemas.openxmlformats.org/officeDocument/2006/customXml" ds:itemID="{19C5C737-631B-49DE-B0F2-34A13868C5A8}">
-  <ds:schemaRefs>
-    <ds:schemaRef ds:uri="http://schemas.openxmlformats.org/officeDocument/2006/bibliography"/>
-  </ds:schemaRefs>
-</ds:datastoreItem>
+<file path=customXml/item2.xml><?xml version="1.0" encoding="utf-8"?>
+<b:Sources xmlns:b="http://schemas.openxmlformats.org/officeDocument/2006/bibliography" xmlns="http://schemas.openxmlformats.org/officeDocument/2006/bibliography" SelectedStyle="\APASixthEditionOfficeOnline.xsl" StyleName="APA" Version="6"/>
 </file>
 
-<file path=customXml/itemProps2.xml><?xml version="1.0" encoding="utf-8"?>
+<file path=customXml/itemProps1.xml><?xml version="1.0" encoding="utf-8"?>
 <ds:datastoreItem xmlns:ds="http://schemas.openxmlformats.org/officeDocument/2006/customXml" ds:itemID="{11111111-1234-1234-1234-123412341234}">
   <ds:schemaRefs>
     <ds:schemaRef ds:uri="http://customooxmlschemas.google.com/"/>
     <ds:schemaRef ds:uri="http://schemas.openxmlformats.org/officeDocument/2006/relationships"/>
   </ds:schemaRefs>
 </ds:datastoreItem>
+</file>
+
+<file path=customXml/itemProps2.xml><?xml version="1.0" encoding="utf-8"?>
+<ds:datastoreItem xmlns:ds="http://schemas.openxmlformats.org/officeDocument/2006/customXml" ds:itemID="{19C5C737-631B-49DE-B0F2-34A13868C5A8}">
+  <ds:schemaRefs>
+    <ds:schemaRef ds:uri="http://schemas.openxmlformats.org/officeDocument/2006/bibliography"/>
+  </ds:schemaRefs>
+</ds:datastoreItem>
 </file>
</xml_diff>